<commit_message>
updating the page content
</commit_message>
<xml_diff>
--- a/Document/Merged document.docx
+++ b/Document/Merged document.docx
@@ -5061,6 +5061,12 @@
             <w:insideH w:val="single" w:color="auto" w:sz="4" w:space="0"/>
             <w:insideV w:val="single" w:color="auto" w:sz="4" w:space="0"/>
           </w:tblBorders>
+          <w:tblCellMar>
+            <w:top w:w="0" w:type="dxa"/>
+            <w:left w:w="108" w:type="dxa"/>
+            <w:bottom w:w="0" w:type="dxa"/>
+            <w:right w:w="108" w:type="dxa"/>
+          </w:tblCellMar>
         </w:tblPrEx>
         <w:tc>
           <w:tcPr>
@@ -7596,8 +7602,6 @@
           <w:lang w:val="en-US" w:eastAsia="zh-CN" w:bidi="ar-SA"/>
         </w:rPr>
       </w:pPr>
-      <w:bookmarkStart w:id="0" w:name="_GoBack"/>
-      <w:bookmarkEnd w:id="0"/>
     </w:p>
     <w:p>
       <w:pPr>
@@ -7813,6 +7817,12 @@
             <w:insideH w:val="single" w:color="888888" w:sz="4" w:space="0"/>
             <w:insideV w:val="single" w:color="888888" w:sz="4" w:space="0"/>
           </w:tblBorders>
+          <w:tblCellMar>
+            <w:top w:w="0" w:type="dxa"/>
+            <w:left w:w="10" w:type="dxa"/>
+            <w:bottom w:w="0" w:type="dxa"/>
+            <w:right w:w="10" w:type="dxa"/>
+          </w:tblCellMar>
         </w:tblPrEx>
         <w:trPr>
           <w:trHeight w:val="90" w:hRule="atLeast"/>
@@ -12785,6 +12795,166 @@
     </w:p>
     <w:p>
       <w:pPr>
+        <w:numPr>
+          <w:numId w:val="0"/>
+        </w:numPr>
+        <w:tabs>
+          <w:tab w:val="left" w:pos="420"/>
+        </w:tabs>
+        <w:spacing w:after="120"/>
+        <w:jc w:val="both"/>
+        <w:rPr>
+          <w:rFonts w:hint="default" w:ascii="Calibri" w:hAnsi="Calibri" w:cs="Calibri"/>
+          <w:sz w:val="24"/>
+          <w:szCs w:val="24"/>
+        </w:rPr>
+      </w:pPr>
+    </w:p>
+    <w:p>
+      <w:pPr>
+        <w:numPr>
+          <w:numId w:val="0"/>
+        </w:numPr>
+        <w:tabs>
+          <w:tab w:val="left" w:pos="420"/>
+        </w:tabs>
+        <w:spacing w:after="120"/>
+        <w:jc w:val="both"/>
+        <w:rPr>
+          <w:rFonts w:hint="default" w:ascii="Calibri" w:hAnsi="Calibri" w:cs="Calibri"/>
+          <w:sz w:val="24"/>
+          <w:szCs w:val="24"/>
+        </w:rPr>
+      </w:pPr>
+    </w:p>
+    <w:p>
+      <w:pPr>
+        <w:numPr>
+          <w:numId w:val="0"/>
+        </w:numPr>
+        <w:tabs>
+          <w:tab w:val="left" w:pos="420"/>
+        </w:tabs>
+        <w:spacing w:after="120"/>
+        <w:jc w:val="both"/>
+        <w:rPr>
+          <w:rFonts w:hint="default" w:ascii="Calibri" w:hAnsi="Calibri" w:cs="Calibri"/>
+          <w:sz w:val="24"/>
+          <w:szCs w:val="24"/>
+        </w:rPr>
+      </w:pPr>
+    </w:p>
+    <w:p>
+      <w:pPr>
+        <w:numPr>
+          <w:numId w:val="0"/>
+        </w:numPr>
+        <w:tabs>
+          <w:tab w:val="left" w:pos="420"/>
+        </w:tabs>
+        <w:spacing w:after="120"/>
+        <w:jc w:val="both"/>
+        <w:rPr>
+          <w:rFonts w:hint="default" w:ascii="Calibri" w:hAnsi="Calibri" w:cs="Calibri"/>
+          <w:sz w:val="24"/>
+          <w:szCs w:val="24"/>
+        </w:rPr>
+      </w:pPr>
+    </w:p>
+    <w:p>
+      <w:pPr>
+        <w:numPr>
+          <w:numId w:val="0"/>
+        </w:numPr>
+        <w:tabs>
+          <w:tab w:val="left" w:pos="420"/>
+        </w:tabs>
+        <w:spacing w:after="120"/>
+        <w:jc w:val="both"/>
+        <w:rPr>
+          <w:rFonts w:hint="default" w:ascii="Calibri" w:hAnsi="Calibri" w:cs="Calibri"/>
+          <w:sz w:val="24"/>
+          <w:szCs w:val="24"/>
+        </w:rPr>
+      </w:pPr>
+    </w:p>
+    <w:p>
+      <w:pPr>
+        <w:numPr>
+          <w:numId w:val="0"/>
+        </w:numPr>
+        <w:tabs>
+          <w:tab w:val="left" w:pos="420"/>
+        </w:tabs>
+        <w:spacing w:after="120"/>
+        <w:jc w:val="both"/>
+        <w:rPr>
+          <w:rFonts w:hint="default" w:ascii="Calibri" w:hAnsi="Calibri" w:cs="Calibri"/>
+          <w:sz w:val="24"/>
+          <w:szCs w:val="24"/>
+        </w:rPr>
+      </w:pPr>
+    </w:p>
+    <w:p>
+      <w:pPr>
+        <w:numPr>
+          <w:numId w:val="0"/>
+        </w:numPr>
+        <w:tabs>
+          <w:tab w:val="left" w:pos="420"/>
+        </w:tabs>
+        <w:spacing w:after="120"/>
+        <w:jc w:val="both"/>
+        <w:rPr>
+          <w:rFonts w:hint="default" w:ascii="Calibri" w:hAnsi="Calibri" w:cs="Calibri"/>
+          <w:b/>
+          <w:bCs/>
+          <w:sz w:val="32"/>
+          <w:szCs w:val="32"/>
+          <w:lang w:val="en-US"/>
+        </w:rPr>
+      </w:pPr>
+      <w:r>
+        <w:rPr>
+          <w:rFonts w:hint="default" w:ascii="Calibri" w:hAnsi="Calibri" w:cs="Calibri"/>
+          <w:b/>
+          <w:bCs/>
+          <w:sz w:val="32"/>
+          <w:szCs w:val="32"/>
+          <w:lang w:val="en-US"/>
+        </w:rPr>
+        <w:t>Code Repository is available at this URL:</w:t>
+      </w:r>
+    </w:p>
+    <w:p>
+      <w:pPr>
+        <w:numPr>
+          <w:numId w:val="0"/>
+        </w:numPr>
+        <w:tabs>
+          <w:tab w:val="left" w:pos="420"/>
+        </w:tabs>
+        <w:spacing w:after="120"/>
+        <w:jc w:val="both"/>
+        <w:rPr>
+          <w:rFonts w:hint="default" w:ascii="Calibri" w:hAnsi="Calibri" w:cs="Calibri"/>
+          <w:sz w:val="24"/>
+          <w:szCs w:val="24"/>
+          <w:lang w:val="en-US"/>
+        </w:rPr>
+      </w:pPr>
+      <w:r>
+        <w:rPr>
+          <w:rFonts w:hint="default" w:ascii="Calibri" w:hAnsi="Calibri" w:cs="Calibri"/>
+          <w:sz w:val="24"/>
+          <w:szCs w:val="24"/>
+          <w:lang w:val="en-US"/>
+        </w:rPr>
+        <w:t>https://github.com/ajaybhuj24/Master_Dissertation_Project_2026</w:t>
+      </w:r>
+    </w:p>
+    <w:p>
+      <w:pPr>
         <w:rPr>
           <w:rFonts w:hint="default" w:asciiTheme="minorHAnsi" w:hAnsiTheme="minorHAnsi" w:eastAsiaTheme="minorEastAsia" w:cstheme="minorBidi"/>
           <w:sz w:val="20"/>
@@ -12848,6 +13018,8 @@
           <w:docGrid w:linePitch="360" w:charSpace="0"/>
         </w:sectPr>
       </w:pPr>
+      <w:bookmarkStart w:id="0" w:name="_GoBack"/>
+      <w:bookmarkEnd w:id="0"/>
     </w:p>
     <w:p>
       <w:pPr>

</xml_diff>

<commit_message>
comments added in entry file of both backend and frontend
</commit_message>
<xml_diff>
--- a/Document/Merged document.docx
+++ b/Document/Merged document.docx
@@ -6056,8 +6056,8 @@
         </w:rPr>
       </w:pPr>
       <w:bookmarkStart w:id="19" w:name="_Toc27784"/>
-      <w:bookmarkStart w:id="20" w:name="_Toc4889"/>
-      <w:bookmarkStart w:id="21" w:name="_Toc21396"/>
+      <w:bookmarkStart w:id="20" w:name="_Toc21396"/>
+      <w:bookmarkStart w:id="21" w:name="_Toc4889"/>
       <w:r>
         <w:rPr>
           <w:rFonts w:hint="default" w:ascii="Calibri" w:hAnsi="Calibri" w:cs="Calibri" w:eastAsiaTheme="minorEastAsia"/>
@@ -7429,8 +7429,8 @@
         </w:rPr>
       </w:pPr>
       <w:bookmarkStart w:id="30" w:name="_Toc31965"/>
-      <w:bookmarkStart w:id="31" w:name="_Toc12742"/>
-      <w:bookmarkStart w:id="32" w:name="_Toc14327"/>
+      <w:bookmarkStart w:id="31" w:name="_Toc14327"/>
+      <w:bookmarkStart w:id="32" w:name="_Toc12742"/>
       <w:r>
         <w:rPr>
           <w:rFonts w:hint="default" w:ascii="Calibri" w:hAnsi="Calibri" w:eastAsia="Segoe UI" w:cs="Calibri"/>
@@ -7512,8 +7512,8 @@
         </w:rPr>
       </w:pPr>
       <w:bookmarkStart w:id="34" w:name="_Toc15129"/>
-      <w:bookmarkStart w:id="35" w:name="_Toc18078"/>
-      <w:bookmarkStart w:id="36" w:name="_Toc2764"/>
+      <w:bookmarkStart w:id="35" w:name="_Toc2764"/>
+      <w:bookmarkStart w:id="36" w:name="_Toc18078"/>
       <w:r>
         <w:rPr>
           <w:rFonts w:hint="default" w:ascii="Calibri" w:hAnsi="Calibri" w:eastAsia="Segoe UI" w:cs="Calibri"/>
@@ -7575,9 +7575,9 @@
           <w:lang w:val="en-US" w:eastAsia="zh-CN" w:bidi="ar"/>
         </w:rPr>
       </w:pPr>
-      <w:bookmarkStart w:id="37" w:name="_Toc30296"/>
+      <w:bookmarkStart w:id="37" w:name="_Toc5197"/>
       <w:bookmarkStart w:id="38" w:name="_Toc13642"/>
-      <w:bookmarkStart w:id="39" w:name="_Toc5197"/>
+      <w:bookmarkStart w:id="39" w:name="_Toc30296"/>
       <w:r>
         <w:rPr>
           <w:rFonts w:hint="default" w:ascii="Calibri" w:hAnsi="Calibri" w:eastAsia="Segoe UI" w:cs="Calibri"/>
@@ -8429,8 +8429,8 @@
         </w:rPr>
       </w:pPr>
       <w:bookmarkStart w:id="49" w:name="_Toc12759"/>
-      <w:bookmarkStart w:id="50" w:name="_Toc19945"/>
-      <w:bookmarkStart w:id="51" w:name="_Toc26460"/>
+      <w:bookmarkStart w:id="50" w:name="_Toc26460"/>
+      <w:bookmarkStart w:id="51" w:name="_Toc19945"/>
       <w:r>
         <w:rPr>
           <w:rFonts w:hint="default" w:ascii="Calibri" w:hAnsi="Calibri" w:cs="Calibri"/>
@@ -8523,8 +8523,8 @@
           <w:lang w:val="en-US"/>
         </w:rPr>
       </w:pPr>
-      <w:bookmarkStart w:id="53" w:name="_Toc4996"/>
-      <w:bookmarkStart w:id="54" w:name="_Toc22045"/>
+      <w:bookmarkStart w:id="53" w:name="_Toc22045"/>
+      <w:bookmarkStart w:id="54" w:name="_Toc4996"/>
       <w:bookmarkStart w:id="55" w:name="_Toc7979"/>
       <w:r>
         <w:rPr>
@@ -8569,9 +8569,9 @@
           <w:szCs w:val="24"/>
         </w:rPr>
       </w:pPr>
-      <w:bookmarkStart w:id="56" w:name="_Toc13181"/>
-      <w:bookmarkStart w:id="57" w:name="_Toc21281"/>
-      <w:bookmarkStart w:id="58" w:name="_Toc6417"/>
+      <w:bookmarkStart w:id="56" w:name="_Toc21281"/>
+      <w:bookmarkStart w:id="57" w:name="_Toc6417"/>
+      <w:bookmarkStart w:id="58" w:name="_Toc13181"/>
       <w:r>
         <w:rPr>
           <w:rFonts w:hint="default" w:ascii="Calibri" w:hAnsi="Calibri" w:cs="Calibri"/>
@@ -8614,8 +8614,8 @@
           <w:szCs w:val="24"/>
         </w:rPr>
       </w:pPr>
-      <w:bookmarkStart w:id="59" w:name="_Toc1658"/>
-      <w:bookmarkStart w:id="60" w:name="_Toc20610"/>
+      <w:bookmarkStart w:id="59" w:name="_Toc20610"/>
+      <w:bookmarkStart w:id="60" w:name="_Toc1658"/>
       <w:bookmarkStart w:id="61" w:name="_Toc11570"/>
       <w:r>
         <w:rPr>
@@ -8730,9 +8730,9 @@
           <w:szCs w:val="24"/>
         </w:rPr>
       </w:pPr>
-      <w:bookmarkStart w:id="63" w:name="_Toc25230"/>
+      <w:bookmarkStart w:id="63" w:name="_Toc20975"/>
       <w:bookmarkStart w:id="64" w:name="_Toc27057"/>
-      <w:bookmarkStart w:id="65" w:name="_Toc20975"/>
+      <w:bookmarkStart w:id="65" w:name="_Toc25230"/>
       <w:r>
         <w:rPr>
           <w:rFonts w:hint="default" w:ascii="Calibri" w:hAnsi="Calibri" w:cs="Calibri"/>
@@ -12479,7 +12479,7 @@
       </w:r>
       <w:r>
         <w:rPr>
-          <w:rStyle w:val="10"/>
+          <w:rStyle w:val="6"/>
           <w:rFonts w:hint="default" w:ascii="Calibri" w:hAnsi="Calibri" w:cs="Calibri"/>
           <w:sz w:val="24"/>
           <w:szCs w:val="24"/>
@@ -12588,7 +12588,7 @@
       </w:r>
       <w:r>
         <w:rPr>
-          <w:rStyle w:val="10"/>
+          <w:rStyle w:val="6"/>
           <w:rFonts w:hint="default" w:ascii="Calibri" w:hAnsi="Calibri" w:cs="Calibri"/>
           <w:sz w:val="24"/>
           <w:szCs w:val="24"/>
@@ -12714,7 +12714,7 @@
       </w:r>
       <w:r>
         <w:rPr>
-          <w:rStyle w:val="10"/>
+          <w:rStyle w:val="6"/>
           <w:rFonts w:hint="default" w:ascii="Calibri" w:hAnsi="Calibri" w:cs="Calibri"/>
           <w:sz w:val="24"/>
           <w:szCs w:val="24"/>
@@ -13099,7 +13099,7 @@
       </w:r>
       <w:r>
         <w:rPr>
-          <w:rStyle w:val="10"/>
+          <w:rStyle w:val="6"/>
           <w:rFonts w:hint="default" w:ascii="Calibri" w:hAnsi="Calibri" w:cs="Calibri"/>
           <w:sz w:val="24"/>
           <w:szCs w:val="24"/>
@@ -13208,7 +13208,7 @@
       </w:r>
       <w:r>
         <w:rPr>
-          <w:rStyle w:val="10"/>
+          <w:rStyle w:val="6"/>
           <w:rFonts w:hint="default" w:ascii="Calibri" w:hAnsi="Calibri" w:cs="Calibri"/>
           <w:sz w:val="24"/>
           <w:szCs w:val="24"/>
@@ -13317,20 +13317,20 @@
       </w:r>
       <w:r>
         <w:rPr>
+          <w:rStyle w:val="6"/>
+          <w:rFonts w:hint="default" w:ascii="Calibri" w:hAnsi="Calibri" w:cs="Calibri"/>
+          <w:sz w:val="24"/>
+          <w:szCs w:val="24"/>
+        </w:rPr>
+        <w:t>https://arxiv.org/abs/2312.10997</w:t>
+      </w:r>
+      <w:r>
+        <w:rPr>
           <w:rStyle w:val="10"/>
           <w:rFonts w:hint="default" w:ascii="Calibri" w:hAnsi="Calibri" w:cs="Calibri"/>
           <w:sz w:val="24"/>
           <w:szCs w:val="24"/>
         </w:rPr>
-        <w:t>https://arxiv.org/abs/2312.10997</w:t>
-      </w:r>
-      <w:r>
-        <w:rPr>
-          <w:rStyle w:val="10"/>
-          <w:rFonts w:hint="default" w:ascii="Calibri" w:hAnsi="Calibri" w:cs="Calibri"/>
-          <w:sz w:val="24"/>
-          <w:szCs w:val="24"/>
-        </w:rPr>
         <w:fldChar w:fldCharType="end"/>
       </w:r>
       <w:r>
@@ -13348,15 +13348,32 @@
           <w:szCs w:val="24"/>
           <w:lang w:val="en-US"/>
         </w:rPr>
-        <w:t>19</w:t>
-      </w:r>
-      <w:r>
-        <w:rPr>
-          <w:rFonts w:hint="default" w:ascii="Calibri" w:hAnsi="Calibri" w:cs="Calibri"/>
-          <w:sz w:val="24"/>
-          <w:szCs w:val="24"/>
-        </w:rPr>
-        <w:t xml:space="preserve"> August 2026].</w:t>
+        <w:t>10</w:t>
+      </w:r>
+      <w:r>
+        <w:rPr>
+          <w:rFonts w:hint="default" w:ascii="Calibri" w:hAnsi="Calibri" w:cs="Calibri"/>
+          <w:sz w:val="24"/>
+          <w:szCs w:val="24"/>
+        </w:rPr>
+        <w:t xml:space="preserve"> </w:t>
+      </w:r>
+      <w:r>
+        <w:rPr>
+          <w:rFonts w:hint="default" w:ascii="Calibri" w:hAnsi="Calibri" w:cs="Calibri"/>
+          <w:sz w:val="24"/>
+          <w:szCs w:val="24"/>
+          <w:lang w:val="en-US"/>
+        </w:rPr>
+        <w:t xml:space="preserve">July </w:t>
+      </w:r>
+      <w:r>
+        <w:rPr>
+          <w:rFonts w:hint="default" w:ascii="Calibri" w:hAnsi="Calibri" w:cs="Calibri"/>
+          <w:sz w:val="24"/>
+          <w:szCs w:val="24"/>
+        </w:rPr>
+        <w:t>2026].</w:t>
       </w:r>
     </w:p>
     <w:p>
@@ -13552,7 +13569,7 @@
       </w:r>
       <w:r>
         <w:rPr>
-          <w:rStyle w:val="10"/>
+          <w:rStyle w:val="6"/>
           <w:rFonts w:hint="default" w:ascii="Calibri" w:hAnsi="Calibri" w:cs="Calibri"/>
           <w:sz w:val="24"/>
           <w:szCs w:val="24"/>
@@ -13871,7 +13888,7 @@
       </w:r>
       <w:r>
         <w:rPr>
-          <w:rStyle w:val="10"/>
+          <w:rStyle w:val="6"/>
           <w:rFonts w:hint="default" w:ascii="Calibri" w:hAnsi="Calibri" w:cs="Calibri"/>
           <w:sz w:val="24"/>
           <w:szCs w:val="24"/>
@@ -13963,7 +13980,7 @@
       </w:r>
       <w:r>
         <w:rPr>
-          <w:rStyle w:val="10"/>
+          <w:rStyle w:val="6"/>
           <w:rFonts w:hint="default" w:ascii="Calibri" w:hAnsi="Calibri" w:cs="Calibri"/>
           <w:sz w:val="24"/>
           <w:szCs w:val="24"/>
@@ -14164,7 +14181,7 @@
       </w:r>
       <w:r>
         <w:rPr>
-          <w:rStyle w:val="10"/>
+          <w:rStyle w:val="6"/>
           <w:rFonts w:hint="default" w:ascii="Calibri" w:hAnsi="Calibri" w:cs="Calibri"/>
           <w:sz w:val="24"/>
           <w:szCs w:val="24"/>
@@ -14273,7 +14290,7 @@
       </w:r>
       <w:r>
         <w:rPr>
-          <w:rStyle w:val="10"/>
+          <w:rStyle w:val="6"/>
           <w:rFonts w:hint="default" w:ascii="Calibri" w:hAnsi="Calibri" w:cs="Calibri"/>
           <w:sz w:val="24"/>
           <w:szCs w:val="24"/>
@@ -14382,7 +14399,7 @@
       </w:r>
       <w:r>
         <w:rPr>
-          <w:rStyle w:val="10"/>
+          <w:rStyle w:val="6"/>
           <w:rFonts w:hint="default" w:ascii="Calibri" w:hAnsi="Calibri" w:cs="Calibri"/>
           <w:sz w:val="24"/>
           <w:szCs w:val="24"/>
@@ -14491,20 +14508,20 @@
       </w:r>
       <w:r>
         <w:rPr>
+          <w:rStyle w:val="6"/>
+          <w:rFonts w:hint="default" w:ascii="Calibri" w:hAnsi="Calibri" w:cs="Calibri"/>
+          <w:sz w:val="24"/>
+          <w:szCs w:val="24"/>
+        </w:rPr>
+        <w:t>https://arxiv.org/abs/2401.15884</w:t>
+      </w:r>
+      <w:r>
+        <w:rPr>
           <w:rStyle w:val="10"/>
           <w:rFonts w:hint="default" w:ascii="Calibri" w:hAnsi="Calibri" w:cs="Calibri"/>
           <w:sz w:val="24"/>
           <w:szCs w:val="24"/>
         </w:rPr>
-        <w:t>https://arxiv.org/abs/2401.15884</w:t>
-      </w:r>
-      <w:r>
-        <w:rPr>
-          <w:rStyle w:val="10"/>
-          <w:rFonts w:hint="default" w:ascii="Calibri" w:hAnsi="Calibri" w:cs="Calibri"/>
-          <w:sz w:val="24"/>
-          <w:szCs w:val="24"/>
-        </w:rPr>
         <w:fldChar w:fldCharType="end"/>
       </w:r>
       <w:r>
@@ -14536,6 +14553,7 @@
     <w:p>
       <w:pPr>
         <w:numPr>
+          <w:ilvl w:val="0"/>
           <w:numId w:val="0"/>
         </w:numPr>
         <w:tabs>
@@ -14549,10 +14567,13 @@
           <w:szCs w:val="24"/>
         </w:rPr>
       </w:pPr>
+      <w:bookmarkStart w:id="83" w:name="_GoBack"/>
+      <w:bookmarkEnd w:id="83"/>
     </w:p>
     <w:p>
       <w:pPr>
         <w:numPr>
+          <w:ilvl w:val="0"/>
           <w:numId w:val="0"/>
         </w:numPr>
         <w:tabs>
@@ -14570,6 +14591,7 @@
     <w:p>
       <w:pPr>
         <w:numPr>
+          <w:ilvl w:val="0"/>
           <w:numId w:val="0"/>
         </w:numPr>
         <w:tabs>
@@ -14587,6 +14609,7 @@
     <w:p>
       <w:pPr>
         <w:numPr>
+          <w:ilvl w:val="0"/>
           <w:numId w:val="0"/>
         </w:numPr>
         <w:tabs>
@@ -14604,6 +14627,7 @@
     <w:p>
       <w:pPr>
         <w:numPr>
+          <w:ilvl w:val="0"/>
           <w:numId w:val="0"/>
         </w:numPr>
         <w:tabs>
@@ -14621,6 +14645,7 @@
     <w:p>
       <w:pPr>
         <w:numPr>
+          <w:ilvl w:val="0"/>
           <w:numId w:val="0"/>
         </w:numPr>
         <w:tabs>
@@ -14638,6 +14663,7 @@
     <w:p>
       <w:pPr>
         <w:numPr>
+          <w:ilvl w:val="0"/>
           <w:numId w:val="0"/>
         </w:numPr>
         <w:tabs>
@@ -14655,6 +14681,7 @@
     <w:p>
       <w:pPr>
         <w:numPr>
+          <w:ilvl w:val="0"/>
           <w:numId w:val="0"/>
         </w:numPr>
         <w:tabs>
@@ -14672,6 +14699,7 @@
     <w:p>
       <w:pPr>
         <w:numPr>
+          <w:ilvl w:val="0"/>
           <w:numId w:val="0"/>
         </w:numPr>
         <w:tabs>
@@ -14685,12 +14713,11 @@
           <w:szCs w:val="24"/>
         </w:rPr>
       </w:pPr>
-      <w:bookmarkStart w:id="83" w:name="_GoBack"/>
-      <w:bookmarkEnd w:id="83"/>
     </w:p>
     <w:p>
       <w:pPr>
         <w:numPr>
+          <w:ilvl w:val="0"/>
           <w:numId w:val="0"/>
         </w:numPr>
         <w:tabs>
@@ -14722,6 +14749,7 @@
     <w:p>
       <w:pPr>
         <w:numPr>
+          <w:ilvl w:val="0"/>
           <w:numId w:val="0"/>
         </w:numPr>
         <w:tabs>

</xml_diff>